<commit_message>
feat: initialize curriculum 2026 revision documentation suite and supporting automation tools
</commit_message>
<xml_diff>
--- a/KURIKULUM2026_REVISI/000_CHANGELOG_ALIGNMENT_FINAL.docx
+++ b/KURIKULUM2026_REVISI/000_CHANGELOG_ALIGNMENT_FINAL.docx
@@ -28,7 +28,7 @@
           <w:color w:val="262626"/>
           <w:sz w:val="21"/>
         </w:rPr>
-        <w:t>Tanggal:</w:t>
+        <w:t>Tanggal terakhir update:</w:t>
       </w:r>
       <w:r>
         <w:rPr>
@@ -36,7 +36,7 @@
           <w:color w:val="262626"/>
           <w:sz w:val="21"/>
         </w:rPr>
-        <w:t xml:space="preserve"> 21 Agustus 2026</w:t>
+        <w:t xml:space="preserve"> 08 September 2026</w:t>
       </w:r>
     </w:p>
     <w:p>
@@ -67,7 +67,7 @@
           <w:color w:val="262626"/>
           <w:sz w:val="21"/>
         </w:rPr>
-        <w:t>COMPLETE — All Documents Fully Aligned</w:t>
+        <w:t>COMPLETE — All Documents Fully Aligned with Dok 005 (Ground Truth)</w:t>
       </w:r>
     </w:p>
     <w:p>
@@ -455,7 +455,7 @@
                 <w:color w:val="262626"/>
                 <w:sz w:val="19"/>
               </w:rPr>
-              <w:t>27 MK / 77 SKS</w:t>
+              <w:t>28 MK / 79 SKS</w:t>
             </w:r>
           </w:p>
         </w:tc>
@@ -482,7 +482,7 @@
                 <w:color w:val="262626"/>
                 <w:sz w:val="19"/>
               </w:rPr>
-              <w:t>✅ Verified (53 occurrences)</w:t>
+              <w:t>✅ Verified</w:t>
             </w:r>
           </w:p>
         </w:tc>
@@ -629,7 +629,7 @@
                 <w:color w:val="262626"/>
                 <w:sz w:val="19"/>
               </w:rPr>
-              <w:t>14 MK / 38 SKS</w:t>
+              <w:t>13 MK / 36 SKS</w:t>
             </w:r>
           </w:p>
         </w:tc>
@@ -793,7 +793,7 @@
           <w:color w:val="2E75B6"/>
           <w:sz w:val="23"/>
         </w:rPr>
-        <w:t>**STI-405: Dasar Keamanan Informasi**</w:t>
+        <w:t>**STI-418: Dasar Keamanan Informasi**</w:t>
       </w:r>
     </w:p>
     <w:p>
@@ -957,7 +957,7 @@
           <w:color w:val="2E75B6"/>
           <w:sz w:val="23"/>
         </w:rPr>
-        <w:t>**STI-602: Smart City &amp; Pemerintahan Digital**</w:t>
+        <w:t>**STI-625: Smart City &amp; Pemerintahan Digital**</w:t>
       </w:r>
     </w:p>
     <w:p>
@@ -1097,7 +1097,7 @@
           <w:color w:val="262626"/>
           <w:sz w:val="21"/>
         </w:rPr>
-        <w:t xml:space="preserve"> Fokus ke konseptual framework SPBE, Smart City Architecture, dan Digital Government Policy (tanpa hands-on IoT prototyping yang sudah dicakup STI-504)</w:t>
+        <w:t xml:space="preserve"> Fokus ke konseptual framework SPBE, Smart City Architecture, dan Digital Government Policy (tanpa hands-on IoT prototyping yang sudah dicakup STI-521)</w:t>
       </w:r>
     </w:p>
     <w:p>
@@ -1381,7 +1381,7 @@
                 <w:color w:val="262626"/>
                 <w:sz w:val="19"/>
               </w:rPr>
-              <w:t>10 MK</w:t>
+              <w:t>8 MK</w:t>
             </w:r>
           </w:p>
         </w:tc>
@@ -1495,7 +1495,7 @@
                 <w:color w:val="262626"/>
                 <w:sz w:val="19"/>
               </w:rPr>
-              <w:t>10 MK</w:t>
+              <w:t>8 MK</w:t>
             </w:r>
           </w:p>
         </w:tc>
@@ -1609,7 +1609,7 @@
                 <w:color w:val="262626"/>
                 <w:sz w:val="19"/>
               </w:rPr>
-              <w:t>10 MK</w:t>
+              <w:t>7 MK</w:t>
             </w:r>
           </w:p>
         </w:tc>
@@ -1724,7 +1724,7 @@
                 <w:color w:val="262626"/>
                 <w:sz w:val="19"/>
               </w:rPr>
-              <w:t>9 MK</w:t>
+              <w:t>8 MK</w:t>
             </w:r>
           </w:p>
         </w:tc>
@@ -1751,7 +1751,7 @@
                 <w:color w:val="262626"/>
                 <w:sz w:val="19"/>
               </w:rPr>
-              <w:t>✅ (Turun dari 22 SKS)</w:t>
+              <w:t>✅</w:t>
             </w:r>
           </w:p>
         </w:tc>
@@ -1953,7 +1953,7 @@
                 <w:color w:val="262626"/>
                 <w:sz w:val="19"/>
               </w:rPr>
-              <w:t>8 MK</w:t>
+              <w:t>7 MK</w:t>
             </w:r>
           </w:p>
         </w:tc>
@@ -1980,7 +1980,7 @@
                 <w:color w:val="262626"/>
                 <w:sz w:val="19"/>
               </w:rPr>
-              <w:t>✅ (Turun dari 20 SKS)</w:t>
+              <w:t>✅</w:t>
             </w:r>
           </w:p>
         </w:tc>
@@ -2383,7 +2383,7 @@
           <w:color w:val="262626"/>
           <w:sz w:val="21"/>
         </w:rPr>
-        <w:t>Semester 4 &amp; 6: Penyesuaian SKS akibat optimasi STI-405 &amp; STI-602</w:t>
+        <w:t>Semester 4 &amp; 6: Penyesuaian SKS akibat optimasi STI-418 &amp; STI-625</w:t>
       </w:r>
     </w:p>
     <w:p>
@@ -3727,7 +3727,203 @@
                 <w:color w:val="A02828"/>
                 <w:sz w:val="18"/>
               </w:rPr>
-              <w:t>79 SKS</w:t>
+              <w:t>77 SKS</w:t>
+            </w:r>
+            <w:r>
+              <w:rPr>
+                <w:rFonts w:ascii="Calibri" w:hAnsi="Calibri"/>
+                <w:color w:val="262626"/>
+                <w:sz w:val="19"/>
+              </w:rPr>
+              <w:t xml:space="preserve"> (Core STI lama)</w:t>
+            </w:r>
+          </w:p>
+        </w:tc>
+        <w:tc>
+          <w:tcPr>
+            <w:tcW w:type="dxa" w:w="3010"/>
+            <w:vAlign w:val="center"/>
+            <w:shd w:fill="F2F5F9"/>
+            <w:tcMar>
+              <w:top w:w="80" w:type="dxa"/>
+              <w:bottom w:w="80" w:type="dxa"/>
+              <w:left w:w="100" w:type="dxa"/>
+              <w:right w:w="100" w:type="dxa"/>
+            </w:tcMar>
+          </w:tcPr>
+          <w:p>
+            <w:pPr>
+              <w:spacing w:before="20" w:after="20" w:line="252" w:lineRule="auto"/>
+              <w:jc w:val="left"/>
+            </w:pPr>
+            <w:r>
+              <w:rPr>
+                <w:rFonts w:ascii="Calibri" w:hAnsi="Calibri"/>
+                <w:color w:val="262626"/>
+                <w:sz w:val="19"/>
+              </w:rPr>
+              <w:t>0</w:t>
+            </w:r>
+          </w:p>
+        </w:tc>
+        <w:tc>
+          <w:tcPr>
+            <w:tcW w:type="dxa" w:w="3010"/>
+            <w:vAlign w:val="center"/>
+            <w:shd w:fill="F2F5F9"/>
+            <w:tcMar>
+              <w:top w:w="80" w:type="dxa"/>
+              <w:bottom w:w="80" w:type="dxa"/>
+              <w:left w:w="100" w:type="dxa"/>
+              <w:right w:w="100" w:type="dxa"/>
+            </w:tcMar>
+          </w:tcPr>
+          <w:p>
+            <w:pPr>
+              <w:spacing w:before="20" w:after="20" w:line="252" w:lineRule="auto"/>
+              <w:jc w:val="left"/>
+            </w:pPr>
+            <w:r>
+              <w:rPr>
+                <w:rFonts w:ascii="Calibri" w:hAnsi="Calibri"/>
+                <w:color w:val="262626"/>
+                <w:sz w:val="19"/>
+              </w:rPr>
+              <w:t>✅ Clear</w:t>
+            </w:r>
+          </w:p>
+        </w:tc>
+      </w:tr>
+      <w:tr>
+        <w:trPr>
+          <w:cantSplit/>
+        </w:trPr>
+        <w:tc>
+          <w:tcPr>
+            <w:tcW w:type="dxa" w:w="3010"/>
+            <w:vAlign w:val="center"/>
+            <w:shd w:fill="FFFFFF"/>
+            <w:tcMar>
+              <w:top w:w="80" w:type="dxa"/>
+              <w:bottom w:w="80" w:type="dxa"/>
+              <w:left w:w="100" w:type="dxa"/>
+              <w:right w:w="100" w:type="dxa"/>
+            </w:tcMar>
+          </w:tcPr>
+          <w:p>
+            <w:pPr>
+              <w:spacing w:before="20" w:after="20" w:line="252" w:lineRule="auto"/>
+              <w:jc w:val="left"/>
+            </w:pPr>
+            <w:r>
+              <w:rPr>
+                <w:rFonts w:ascii="Consolas" w:hAnsi="Consolas"/>
+                <w:color w:val="A02828"/>
+                <w:sz w:val="18"/>
+              </w:rPr>
+              <w:t>14 MK / 38 SKS</w:t>
+            </w:r>
+            <w:r>
+              <w:rPr>
+                <w:rFonts w:ascii="Calibri" w:hAnsi="Calibri"/>
+                <w:color w:val="262626"/>
+                <w:sz w:val="19"/>
+              </w:rPr>
+              <w:t xml:space="preserve"> (FSTI lama)</w:t>
+            </w:r>
+          </w:p>
+        </w:tc>
+        <w:tc>
+          <w:tcPr>
+            <w:tcW w:type="dxa" w:w="3010"/>
+            <w:vAlign w:val="center"/>
+            <w:shd w:fill="FFFFFF"/>
+            <w:tcMar>
+              <w:top w:w="80" w:type="dxa"/>
+              <w:bottom w:w="80" w:type="dxa"/>
+              <w:left w:w="100" w:type="dxa"/>
+              <w:right w:w="100" w:type="dxa"/>
+            </w:tcMar>
+          </w:tcPr>
+          <w:p>
+            <w:pPr>
+              <w:spacing w:before="20" w:after="20" w:line="252" w:lineRule="auto"/>
+              <w:jc w:val="left"/>
+            </w:pPr>
+            <w:r>
+              <w:rPr>
+                <w:rFonts w:ascii="Calibri" w:hAnsi="Calibri"/>
+                <w:color w:val="262626"/>
+                <w:sz w:val="19"/>
+              </w:rPr>
+              <w:t>0</w:t>
+            </w:r>
+          </w:p>
+        </w:tc>
+        <w:tc>
+          <w:tcPr>
+            <w:tcW w:type="dxa" w:w="3010"/>
+            <w:vAlign w:val="center"/>
+            <w:shd w:fill="FFFFFF"/>
+            <w:tcMar>
+              <w:top w:w="80" w:type="dxa"/>
+              <w:bottom w:w="80" w:type="dxa"/>
+              <w:left w:w="100" w:type="dxa"/>
+              <w:right w:w="100" w:type="dxa"/>
+            </w:tcMar>
+          </w:tcPr>
+          <w:p>
+            <w:pPr>
+              <w:spacing w:before="20" w:after="20" w:line="252" w:lineRule="auto"/>
+              <w:jc w:val="left"/>
+            </w:pPr>
+            <w:r>
+              <w:rPr>
+                <w:rFonts w:ascii="Calibri" w:hAnsi="Calibri"/>
+                <w:color w:val="262626"/>
+                <w:sz w:val="19"/>
+              </w:rPr>
+              <w:t>✅ Clear</w:t>
+            </w:r>
+          </w:p>
+        </w:tc>
+      </w:tr>
+      <w:tr>
+        <w:trPr>
+          <w:cantSplit/>
+        </w:trPr>
+        <w:tc>
+          <w:tcPr>
+            <w:tcW w:type="dxa" w:w="3010"/>
+            <w:vAlign w:val="center"/>
+            <w:shd w:fill="F2F5F9"/>
+            <w:tcMar>
+              <w:top w:w="80" w:type="dxa"/>
+              <w:bottom w:w="80" w:type="dxa"/>
+              <w:left w:w="100" w:type="dxa"/>
+              <w:right w:w="100" w:type="dxa"/>
+            </w:tcMar>
+          </w:tcPr>
+          <w:p>
+            <w:pPr>
+              <w:spacing w:before="20" w:after="20" w:line="252" w:lineRule="auto"/>
+              <w:jc w:val="left"/>
+            </w:pPr>
+            <w:r>
+              <w:rPr>
+                <w:rFonts w:ascii="Consolas" w:hAnsi="Consolas"/>
+                <w:color w:val="A02828"/>
+                <w:sz w:val="18"/>
+              </w:rPr>
+              <w:t>27 MK / 77 SKS</w:t>
+            </w:r>
+            <w:r>
+              <w:rPr>
+                <w:rFonts w:ascii="Calibri" w:hAnsi="Calibri"/>
+                <w:color w:val="262626"/>
+                <w:sz w:val="19"/>
+              </w:rPr>
+              <w:t xml:space="preserve"> (Core STI lama)</w:t>
             </w:r>
           </w:p>
         </w:tc>
@@ -3957,7 +4153,7 @@
                 <w:color w:val="262626"/>
                 <w:sz w:val="19"/>
               </w:rPr>
-              <w:t>195</w:t>
+              <w:t>≥195</w:t>
             </w:r>
           </w:p>
         </w:tc>
@@ -4043,7 +4239,7 @@
                 <w:color w:val="262626"/>
                 <w:sz w:val="19"/>
               </w:rPr>
-              <w:t>71</w:t>
+              <w:t>≥71</w:t>
             </w:r>
           </w:p>
         </w:tc>
@@ -4102,7 +4298,15 @@
                 <w:color w:val="A02828"/>
                 <w:sz w:val="18"/>
               </w:rPr>
-              <w:t>77 SKS</w:t>
+              <w:t>79 SKS</w:t>
+            </w:r>
+            <w:r>
+              <w:rPr>
+                <w:rFonts w:ascii="Calibri" w:hAnsi="Calibri"/>
+                <w:color w:val="262626"/>
+                <w:sz w:val="19"/>
+              </w:rPr>
+              <w:t xml:space="preserve"> (Core STI baru)</w:t>
             </w:r>
           </w:p>
         </w:tc>
@@ -4129,7 +4333,195 @@
                 <w:color w:val="262626"/>
                 <w:sz w:val="19"/>
               </w:rPr>
-              <w:t>53</w:t>
+              <w:t>≥1</w:t>
+            </w:r>
+          </w:p>
+        </w:tc>
+        <w:tc>
+          <w:tcPr>
+            <w:tcW w:type="dxa" w:w="3010"/>
+            <w:vAlign w:val="center"/>
+            <w:shd w:fill="FFFFFF"/>
+            <w:tcMar>
+              <w:top w:w="80" w:type="dxa"/>
+              <w:bottom w:w="80" w:type="dxa"/>
+              <w:left w:w="100" w:type="dxa"/>
+              <w:right w:w="100" w:type="dxa"/>
+            </w:tcMar>
+          </w:tcPr>
+          <w:p>
+            <w:pPr>
+              <w:spacing w:before="20" w:after="20" w:line="252" w:lineRule="auto"/>
+              <w:jc w:val="left"/>
+            </w:pPr>
+            <w:r>
+              <w:rPr>
+                <w:rFonts w:ascii="Calibri" w:hAnsi="Calibri"/>
+                <w:color w:val="262626"/>
+                <w:sz w:val="19"/>
+              </w:rPr>
+              <w:t>✅ Verified</w:t>
+            </w:r>
+          </w:p>
+        </w:tc>
+      </w:tr>
+      <w:tr>
+        <w:trPr>
+          <w:cantSplit/>
+        </w:trPr>
+        <w:tc>
+          <w:tcPr>
+            <w:tcW w:type="dxa" w:w="3010"/>
+            <w:vAlign w:val="center"/>
+            <w:shd w:fill="F2F5F9"/>
+            <w:tcMar>
+              <w:top w:w="80" w:type="dxa"/>
+              <w:bottom w:w="80" w:type="dxa"/>
+              <w:left w:w="100" w:type="dxa"/>
+              <w:right w:w="100" w:type="dxa"/>
+            </w:tcMar>
+          </w:tcPr>
+          <w:p>
+            <w:pPr>
+              <w:spacing w:before="20" w:after="20" w:line="252" w:lineRule="auto"/>
+              <w:jc w:val="left"/>
+            </w:pPr>
+            <w:r>
+              <w:rPr>
+                <w:rFonts w:ascii="Consolas" w:hAnsi="Consolas"/>
+                <w:color w:val="A02828"/>
+                <w:sz w:val="18"/>
+              </w:rPr>
+              <w:t>13 MK / 36 SKS</w:t>
+            </w:r>
+            <w:r>
+              <w:rPr>
+                <w:rFonts w:ascii="Calibri" w:hAnsi="Calibri"/>
+                <w:color w:val="262626"/>
+                <w:sz w:val="19"/>
+              </w:rPr>
+              <w:t xml:space="preserve"> (FSTI baru)</w:t>
+            </w:r>
+          </w:p>
+        </w:tc>
+        <w:tc>
+          <w:tcPr>
+            <w:tcW w:type="dxa" w:w="3010"/>
+            <w:vAlign w:val="center"/>
+            <w:shd w:fill="F2F5F9"/>
+            <w:tcMar>
+              <w:top w:w="80" w:type="dxa"/>
+              <w:bottom w:w="80" w:type="dxa"/>
+              <w:left w:w="100" w:type="dxa"/>
+              <w:right w:w="100" w:type="dxa"/>
+            </w:tcMar>
+          </w:tcPr>
+          <w:p>
+            <w:pPr>
+              <w:spacing w:before="20" w:after="20" w:line="252" w:lineRule="auto"/>
+              <w:jc w:val="left"/>
+            </w:pPr>
+            <w:r>
+              <w:rPr>
+                <w:rFonts w:ascii="Calibri" w:hAnsi="Calibri"/>
+                <w:color w:val="262626"/>
+                <w:sz w:val="19"/>
+              </w:rPr>
+              <w:t>≥1</w:t>
+            </w:r>
+          </w:p>
+        </w:tc>
+        <w:tc>
+          <w:tcPr>
+            <w:tcW w:type="dxa" w:w="3010"/>
+            <w:vAlign w:val="center"/>
+            <w:shd w:fill="F2F5F9"/>
+            <w:tcMar>
+              <w:top w:w="80" w:type="dxa"/>
+              <w:bottom w:w="80" w:type="dxa"/>
+              <w:left w:w="100" w:type="dxa"/>
+              <w:right w:w="100" w:type="dxa"/>
+            </w:tcMar>
+          </w:tcPr>
+          <w:p>
+            <w:pPr>
+              <w:spacing w:before="20" w:after="20" w:line="252" w:lineRule="auto"/>
+              <w:jc w:val="left"/>
+            </w:pPr>
+            <w:r>
+              <w:rPr>
+                <w:rFonts w:ascii="Calibri" w:hAnsi="Calibri"/>
+                <w:color w:val="262626"/>
+                <w:sz w:val="19"/>
+              </w:rPr>
+              <w:t>✅ Verified</w:t>
+            </w:r>
+          </w:p>
+        </w:tc>
+      </w:tr>
+      <w:tr>
+        <w:trPr>
+          <w:cantSplit/>
+        </w:trPr>
+        <w:tc>
+          <w:tcPr>
+            <w:tcW w:type="dxa" w:w="3010"/>
+            <w:vAlign w:val="center"/>
+            <w:shd w:fill="FFFFFF"/>
+            <w:tcMar>
+              <w:top w:w="80" w:type="dxa"/>
+              <w:bottom w:w="80" w:type="dxa"/>
+              <w:left w:w="100" w:type="dxa"/>
+              <w:right w:w="100" w:type="dxa"/>
+            </w:tcMar>
+          </w:tcPr>
+          <w:p>
+            <w:pPr>
+              <w:spacing w:before="20" w:after="20" w:line="252" w:lineRule="auto"/>
+              <w:jc w:val="left"/>
+            </w:pPr>
+            <w:r>
+              <w:rPr>
+                <w:rFonts w:ascii="Consolas" w:hAnsi="Consolas"/>
+                <w:color w:val="A02828"/>
+                <w:sz w:val="18"/>
+              </w:rPr>
+              <w:t>28 MK / 79 SKS</w:t>
+            </w:r>
+            <w:r>
+              <w:rPr>
+                <w:rFonts w:ascii="Calibri" w:hAnsi="Calibri"/>
+                <w:color w:val="262626"/>
+                <w:sz w:val="19"/>
+              </w:rPr>
+              <w:t xml:space="preserve"> (Core STI baru)</w:t>
+            </w:r>
+          </w:p>
+        </w:tc>
+        <w:tc>
+          <w:tcPr>
+            <w:tcW w:type="dxa" w:w="3010"/>
+            <w:vAlign w:val="center"/>
+            <w:shd w:fill="FFFFFF"/>
+            <w:tcMar>
+              <w:top w:w="80" w:type="dxa"/>
+              <w:bottom w:w="80" w:type="dxa"/>
+              <w:left w:w="100" w:type="dxa"/>
+              <w:right w:w="100" w:type="dxa"/>
+            </w:tcMar>
+          </w:tcPr>
+          <w:p>
+            <w:pPr>
+              <w:spacing w:before="20" w:after="20" w:line="252" w:lineRule="auto"/>
+              <w:jc w:val="left"/>
+            </w:pPr>
+            <w:r>
+              <w:rPr>
+                <w:rFonts w:ascii="Calibri" w:hAnsi="Calibri"/>
+                <w:color w:val="262626"/>
+                <w:sz w:val="19"/>
+              </w:rPr>
+              <w:t>≥1</w:t>
             </w:r>
           </w:p>
         </w:tc>
@@ -4304,7 +4696,7 @@
           <w:color w:val="A02828"/>
           <w:sz w:val="20"/>
         </w:rPr>
-        <w:t>79 SKS</w:t>
+        <w:t>14 MK / 38 SKS</w:t>
       </w:r>
       <w:r>
         <w:rPr>
@@ -4312,7 +4704,7 @@
           <w:color w:val="262626"/>
           <w:sz w:val="21"/>
         </w:rPr>
-        <w:t xml:space="preserve"> → </w:t>
+        <w:t xml:space="preserve"> (FSTI) → </w:t>
       </w:r>
       <w:r>
         <w:rPr>
@@ -4320,7 +4712,121 @@
           <w:color w:val="A02828"/>
           <w:sz w:val="20"/>
         </w:rPr>
-        <w:t>77 SKS</w:t>
+        <w:t>13 MK / 36 SKS</w:t>
+      </w:r>
+    </w:p>
+    <w:p>
+      <w:pPr>
+        <w:pStyle w:val="ListBullet"/>
+        <w:spacing w:before="20" w:after="40" w:line="276" w:lineRule="auto"/>
+      </w:pPr>
+      <w:r>
+        <w:rPr>
+          <w:rFonts w:ascii="Calibri" w:hAnsi="Calibri"/>
+          <w:color w:val="262626"/>
+          <w:sz w:val="21"/>
+        </w:rPr>
+        <w:t xml:space="preserve">Mengganti semua kemunculan </w:t>
+      </w:r>
+      <w:r>
+        <w:rPr>
+          <w:rFonts w:ascii="Consolas" w:hAnsi="Consolas"/>
+          <w:color w:val="A02828"/>
+          <w:sz w:val="20"/>
+        </w:rPr>
+        <w:t>14 MK | 38 SKS</w:t>
+      </w:r>
+      <w:r>
+        <w:rPr>
+          <w:rFonts w:ascii="Calibri" w:hAnsi="Calibri"/>
+          <w:color w:val="262626"/>
+          <w:sz w:val="21"/>
+        </w:rPr>
+        <w:t xml:space="preserve"> (FSTI) → </w:t>
+      </w:r>
+      <w:r>
+        <w:rPr>
+          <w:rFonts w:ascii="Consolas" w:hAnsi="Consolas"/>
+          <w:color w:val="A02828"/>
+          <w:sz w:val="20"/>
+        </w:rPr>
+        <w:t>13 MK | 36 SKS</w:t>
+      </w:r>
+    </w:p>
+    <w:p>
+      <w:pPr>
+        <w:pStyle w:val="ListBullet"/>
+        <w:spacing w:before="20" w:after="40" w:line="276" w:lineRule="auto"/>
+      </w:pPr>
+      <w:r>
+        <w:rPr>
+          <w:rFonts w:ascii="Calibri" w:hAnsi="Calibri"/>
+          <w:color w:val="262626"/>
+          <w:sz w:val="21"/>
+        </w:rPr>
+        <w:t xml:space="preserve">Mengganti semua kemunculan </w:t>
+      </w:r>
+      <w:r>
+        <w:rPr>
+          <w:rFonts w:ascii="Consolas" w:hAnsi="Consolas"/>
+          <w:color w:val="A02828"/>
+          <w:sz w:val="20"/>
+        </w:rPr>
+        <w:t>27 MK / 77 SKS</w:t>
+      </w:r>
+      <w:r>
+        <w:rPr>
+          <w:rFonts w:ascii="Calibri" w:hAnsi="Calibri"/>
+          <w:color w:val="262626"/>
+          <w:sz w:val="21"/>
+        </w:rPr>
+        <w:t xml:space="preserve"> (Core STI) → </w:t>
+      </w:r>
+      <w:r>
+        <w:rPr>
+          <w:rFonts w:ascii="Consolas" w:hAnsi="Consolas"/>
+          <w:color w:val="A02828"/>
+          <w:sz w:val="20"/>
+        </w:rPr>
+        <w:t>28 MK / 79 SKS</w:t>
+      </w:r>
+    </w:p>
+    <w:p>
+      <w:pPr>
+        <w:pStyle w:val="ListBullet"/>
+        <w:spacing w:before="20" w:after="40" w:line="276" w:lineRule="auto"/>
+      </w:pPr>
+      <w:r>
+        <w:rPr>
+          <w:rFonts w:ascii="Calibri" w:hAnsi="Calibri"/>
+          <w:color w:val="262626"/>
+          <w:sz w:val="21"/>
+        </w:rPr>
+        <w:t xml:space="preserve">Mengganti semua kemunculan </w:t>
+      </w:r>
+      <w:r>
+        <w:rPr>
+          <w:rFonts w:ascii="Consolas" w:hAnsi="Consolas"/>
+          <w:color w:val="A02828"/>
+          <w:sz w:val="20"/>
+        </w:rPr>
+        <w:t>27 MK | 77 SKS</w:t>
+      </w:r>
+      <w:r>
+        <w:rPr>
+          <w:rFonts w:ascii="Calibri" w:hAnsi="Calibri"/>
+          <w:color w:val="262626"/>
+          <w:sz w:val="21"/>
+        </w:rPr>
+        <w:t xml:space="preserve"> (Core STI) → </w:t>
+      </w:r>
+      <w:r>
+        <w:rPr>
+          <w:rFonts w:ascii="Consolas" w:hAnsi="Consolas"/>
+          <w:color w:val="A02828"/>
+          <w:sz w:val="20"/>
+        </w:rPr>
+        <w:t>28 MK | 79 SKS</w:t>
       </w:r>
     </w:p>
     <w:p>
@@ -4349,7 +4855,7 @@
           <w:color w:val="262626"/>
           <w:sz w:val="21"/>
         </w:rPr>
-        <w:t xml:space="preserve">STI-405: Hanya di kolom </w:t>
+        <w:t xml:space="preserve">STI-418: Hanya di kolom </w:t>
       </w:r>
       <w:r>
         <w:rPr>
@@ -4380,7 +4886,7 @@
           <w:color w:val="262626"/>
           <w:sz w:val="21"/>
         </w:rPr>
-        <w:t xml:space="preserve">STI-602: Hanya untuk </w:t>
+        <w:t xml:space="preserve">STI-625: Hanya untuk </w:t>
       </w:r>
       <w:r>
         <w:rPr>
@@ -4434,7 +4940,7 @@
           <w:color w:val="A02828"/>
           <w:sz w:val="20"/>
         </w:rPr>
-        <w:t>| STI-405 | ... | 3 |</w:t>
+        <w:t>| STI-418 | ... | 3 |</w:t>
       </w:r>
       <w:r>
         <w:rPr>
@@ -4450,7 +4956,7 @@
           <w:color w:val="A02828"/>
           <w:sz w:val="20"/>
         </w:rPr>
-        <w:t>| STI-405 | ... | 2 |</w:t>
+        <w:t>| STI-418 | ... | 2 |</w:t>
       </w:r>
     </w:p>
     <w:p>
@@ -4472,7 +4978,7 @@
           <w:color w:val="A02828"/>
           <w:sz w:val="20"/>
         </w:rPr>
-        <w:t>| STI-602 | ... | 3 |</w:t>
+        <w:t>| STI-625 | ... | 3 |</w:t>
       </w:r>
       <w:r>
         <w:rPr>
@@ -4488,7 +4994,7 @@
           <w:color w:val="A02828"/>
           <w:sz w:val="20"/>
         </w:rPr>
-        <w:t>| STI-602 | ... | 2 |</w:t>
+        <w:t>| STI-625 | ... | 2 |</w:t>
       </w:r>
     </w:p>
     <w:p>
@@ -5028,7 +5534,7 @@
                 <w:color w:val="262626"/>
                 <w:sz w:val="19"/>
               </w:rPr>
-              <w:t>14</w:t>
+              <w:t>13</w:t>
             </w:r>
           </w:p>
         </w:tc>
@@ -5055,7 +5561,7 @@
                 <w:color w:val="262626"/>
                 <w:sz w:val="19"/>
               </w:rPr>
-              <w:t>38</w:t>
+              <w:t>36</w:t>
             </w:r>
           </w:p>
         </w:tc>
@@ -5082,7 +5588,7 @@
                 <w:color w:val="262626"/>
                 <w:sz w:val="19"/>
               </w:rPr>
-              <w:t>26,0%</w:t>
+              <w:t>24,7%</w:t>
             </w:r>
           </w:p>
         </w:tc>
@@ -5143,7 +5649,7 @@
                 <w:color w:val="262626"/>
                 <w:sz w:val="19"/>
               </w:rPr>
-              <w:t>27</w:t>
+              <w:t>28</w:t>
             </w:r>
           </w:p>
         </w:tc>
@@ -5171,7 +5677,7 @@
                 <w:color w:val="262626"/>
                 <w:sz w:val="19"/>
               </w:rPr>
-              <w:t>77</w:t>
+              <w:t>79</w:t>
             </w:r>
           </w:p>
         </w:tc>
@@ -5199,7 +5705,7 @@
                 <w:color w:val="262626"/>
                 <w:sz w:val="19"/>
               </w:rPr>
-              <w:t>52,7%</w:t>
+              <w:t>54,1%</w:t>
             </w:r>
           </w:p>
         </w:tc>
@@ -5650,7 +6156,7 @@
                 <w:color w:val="262626"/>
                 <w:sz w:val="19"/>
               </w:rPr>
-              <w:t>STA-01..06</w:t>
+              <w:t>STA-501..703</w:t>
             </w:r>
           </w:p>
         </w:tc>
@@ -5764,7 +6270,7 @@
                 <w:color w:val="262626"/>
                 <w:sz w:val="19"/>
               </w:rPr>
-              <w:t>STB-01..06</w:t>
+              <w:t>STB-501..703</w:t>
             </w:r>
           </w:p>
         </w:tc>
@@ -5878,7 +6384,7 @@
                 <w:color w:val="262626"/>
                 <w:sz w:val="19"/>
               </w:rPr>
-              <w:t>STC-01..06</w:t>
+              <w:t>STC-501..703</w:t>
             </w:r>
           </w:p>
         </w:tc>
@@ -6127,7 +6633,7 @@
           <w:color w:val="262626"/>
           <w:sz w:val="21"/>
         </w:rPr>
-        <w:t xml:space="preserve">[x] STI-405 &amp; STI-602 @ </w:t>
+        <w:t xml:space="preserve">[x] STI-418 &amp; STI-625 @ </w:t>
       </w:r>
       <w:r>
         <w:rPr>
@@ -6285,7 +6791,7 @@
           <w:color w:val="262626"/>
           <w:sz w:val="21"/>
         </w:rPr>
-        <w:t>52,7%</w:t>
+        <w:t>54,1%</w:t>
       </w:r>
       <w:r>
         <w:rPr>
@@ -6293,7 +6799,38 @@
           <w:color w:val="262626"/>
           <w:sz w:val="21"/>
         </w:rPr>
-        <w:t xml:space="preserve"> dari total paket (sesuai standar OBE)</w:t>
+        <w:t xml:space="preserve"> dari total paket (28 MK / 79 SKS — sesuai Dok 005 &amp; standar OBE)</w:t>
+      </w:r>
+    </w:p>
+    <w:p>
+      <w:pPr>
+        <w:pStyle w:val="ListBullet"/>
+        <w:spacing w:before="20" w:after="40" w:line="276" w:lineRule="auto"/>
+      </w:pPr>
+      <w:r>
+        <w:rPr>
+          <w:rFonts w:ascii="Calibri" w:hAnsi="Calibri"/>
+          <w:color w:val="262626"/>
+          <w:sz w:val="21"/>
+        </w:rPr>
+        <w:t xml:space="preserve">[x] Komposisi MK FSTI: </w:t>
+      </w:r>
+      <w:r>
+        <w:rPr>
+          <w:rFonts w:ascii="Calibri" w:hAnsi="Calibri"/>
+          <w:b/>
+          <w:color w:val="262626"/>
+          <w:sz w:val="21"/>
+        </w:rPr>
+        <w:t>24,7%</w:t>
+      </w:r>
+      <w:r>
+        <w:rPr>
+          <w:rFonts w:ascii="Calibri" w:hAnsi="Calibri"/>
+          <w:color w:val="262626"/>
+          <w:sz w:val="21"/>
+        </w:rPr>
+        <w:t xml:space="preserve"> (13 MK / 36 SKS — diselaraskan Sep 2026)</w:t>
       </w:r>
     </w:p>
     <w:p>
@@ -6358,7 +6895,7 @@
           <w:color w:val="262626"/>
           <w:sz w:val="21"/>
         </w:rPr>
-        <w:t>Perubahan STI-405 &amp; STI-602</w:t>
+        <w:t>Perubahan STI-418 &amp; STI-625</w:t>
       </w:r>
       <w:r>
         <w:rPr>

</xml_diff>